<commit_message>
Add thesis chapter scaffolds and build script
Add docx scaffolds and writing notes for thesis chapters and a script to generate them. New files: Chapter7_Conclusions_DRAFT.docx, Chapter8_Future_Work_DRAFT.docx, Chapter7_writing_notes.md, Chapter8_writing_notes.md, Thesis_insights_scratchpad.md. Archive copies added for Chapter5/6 drafts and notes under docs/Thesis/archive_20260305_125253. Update binary Chapter5 and Chapter6 draft DOCX files. Append processing output lines to out/run_grains_full_grainexport_restart_20260305_091451.out.log. Add scripts/build_thesis_chapters.py to programmatically create chapter DOCX scaffolds and markdown notes (with --overwrite flag to replace existing files).
</commit_message>
<xml_diff>
--- a/docs/Thesis/Chapter5_Statistical_Validation_Framework_DRAFT.docx
+++ b/docs/Thesis/Chapter5_Statistical_Validation_Framework_DRAFT.docx
@@ -7,17 +7,17 @@
         <w:pStyle w:val="Title"/>
       </w:pPr>
       <w:r>
-        <w:t>Chapter 5 Draft ? Statistical Validation Framework (Stage 1)</w:t>
+        <w:t>Chapter 5 Draft — Statistical Validation Framework (Stage 1)</w:t>
       </w:r>
     </w:p>
     <w:p>
       <w:r>
-        <w:t>Draft generated: 2026-03-05 12:38</w:t>
+        <w:t>Draft generated: 2026-03-05 12:52</w:t>
       </w:r>
     </w:p>
     <w:p>
       <w:r>
-        <w:t>Status: skeleton for you to fill with tables/figures from the pipeline outputs.</w:t>
+        <w:t>Status: working draft scaffold. Replace placeholders with prose, tables, and figures.</w:t>
       </w:r>
     </w:p>
     <w:p>
@@ -27,7 +27,7 @@
     </w:p>
     <w:p>
       <w:r>
-        <w:t>Scope limit: This chapter does NOT extract or claim interphase gradients.</w:t>
+        <w:t>Scope limit: this chapter does NOT extract or claim interphase gradients.</w:t>
       </w:r>
     </w:p>
     <w:p>
@@ -40,12 +40,12 @@
     </w:p>
     <w:p>
       <w:r>
-        <w:t>Scan = one 5 ?m ? 5 ?m AFM image acquired at one grid cell (row/col index).</w:t>
+        <w:t>Scan = one 5 um x 5 um AFM image acquired at one grid cell (row/col index).</w:t>
       </w:r>
     </w:p>
     <w:p>
       <w:r>
-        <w:t>Grid = the 21 ? 21 set of scans tiling the nominal 50 ?m ? 50 ?m area (with overlap).</w:t>
+        <w:t>Grid = the 21 x 21 set of scans tiling the nominal 50 um x 50 um area (with overlap).</w:t>
       </w:r>
     </w:p>
     <w:p>
@@ -95,7 +95,7 @@
         <w:rPr>
           <w:b/>
         </w:rPr>
-        <w:t>Table 5.1 ? Processing/Masking Parameters by Job</w:t>
+        <w:t>Table 5.1 — Processing/Masking Parameters by Job</w:t>
       </w:r>
     </w:p>
     <w:tbl>
@@ -237,7 +237,7 @@
         <w:rPr>
           <w:b/>
         </w:rPr>
-        <w:t>[PLACEHOLDER] Define ?particle candidate? in terms of Gwyddion grain detection + filters.</w:t>
+        <w:t>[PLACEHOLDER] Define “particle candidate” in terms of Gwyddion grain detection + filters.</w:t>
       </w:r>
     </w:p>
     <w:p>
@@ -253,7 +253,7 @@
         <w:rPr>
           <w:b/>
         </w:rPr>
-        <w:t>Table 5.2 ? Particle Count Per Scan (one row per scan)</w:t>
+        <w:t>Table 5.2 — Particle Count Per Scan (one row per scan)</w:t>
       </w:r>
     </w:p>
     <w:tbl>
@@ -463,7 +463,7 @@
         <w:rPr>
           <w:b/>
         </w:rPr>
-        <w:t>[PLACEHOLDER] Figure 5.1 ? Histogram of candidate particle counts per scan (by wt% and by job).</w:t>
+        <w:t>[PLACEHOLDER] Figure 5.1 — Histogram of candidate particle counts per scan (by wt% and by job).</w:t>
       </w:r>
     </w:p>
     <w:p>
@@ -471,7 +471,7 @@
         <w:rPr>
           <w:b/>
         </w:rPr>
-        <w:t>[PLACEHOLDER] Figure 5.2 ? Grid heatmap of particle counts (missing scans shown in gray).</w:t>
+        <w:t>[PLACEHOLDER] Figure 5.2 — Grid heatmap of particle counts (missing scans shown in gray).</w:t>
       </w:r>
     </w:p>
     <w:p>
@@ -495,7 +495,7 @@
         <w:rPr>
           <w:b/>
         </w:rPr>
-        <w:t>[PLACEHOLDER] Figure 5.3 ? Diameter histogram (raw and filtered), separated by wt% and job.</w:t>
+        <w:t>[PLACEHOLDER] Figure 5.3 — Diameter histogram (raw and filtered), separated by wt% and job.</w:t>
       </w:r>
     </w:p>
     <w:p>
@@ -503,7 +503,7 @@
         <w:rPr>
           <w:b/>
         </w:rPr>
-        <w:t>Table 5.3 ? Diameter Summary</w:t>
+        <w:t>Table 5.3 — Diameter Summary</w:t>
       </w:r>
     </w:p>
     <w:tbl>
@@ -691,7 +691,7 @@
         <w:rPr>
           <w:b/>
         </w:rPr>
-        <w:t>Table 5.4 ? Isolation Summary by Job and wt%</w:t>
+        <w:t>Table 5.4 — Isolation Summary by Job and wt%</w:t>
       </w:r>
     </w:p>
     <w:tbl>
@@ -756,7 +756,7 @@
           </w:tcPr>
           <w:p>
             <w:r>
-              <w:t>Scans with ?1 isolated</w:t>
+              <w:t>Scans with &gt;= 1 isolated</w:t>
             </w:r>
           </w:p>
         </w:tc>
@@ -766,7 +766,7 @@
           </w:tcPr>
           <w:p>
             <w:r>
-              <w:t>% with ?1 isolated</w:t>
+              <w:t>% with &gt;= 1 isolated</w:t>
             </w:r>
           </w:p>
         </w:tc>
@@ -863,7 +863,7 @@
         <w:rPr>
           <w:b/>
         </w:rPr>
-        <w:t>[PLACEHOLDER] Figure 5.4 ? Isolation count distribution per scan (by wt% and job).</w:t>
+        <w:t>[PLACEHOLDER] Figure 5.4 — Isolation count distribution per scan (by wt% and job).</w:t>
       </w:r>
     </w:p>
     <w:p>
@@ -887,7 +887,7 @@
         <w:rPr>
           <w:b/>
         </w:rPr>
-        <w:t>[PLACEHOLDER] Explicit contrapositive: probability of zero isolated particles after N scans.</w:t>
+        <w:t>[PLACEHOLDER] Explicit contrapositive: probability of zero isolated true particles after N scans.</w:t>
       </w:r>
     </w:p>
     <w:p>
@@ -895,7 +895,7 @@
         <w:rPr>
           <w:b/>
         </w:rPr>
-        <w:t>[PLACEHOLDER] Figure 5.5 ? Required scans vs confidence (or risk curve), by wt% and job.</w:t>
+        <w:t>[PLACEHOLDER] Figure 5.5 — Required scans vs confidence (or risk curve), by wt% and job.</w:t>
       </w:r>
     </w:p>
     <w:p>
@@ -903,7 +903,7 @@
         <w:rPr>
           <w:b/>
         </w:rPr>
-        <w:t>[PLACEHOLDER] Figure 5.6 ? Stage 2 crossover plot: N_req(p) vs p, with N_available line.</w:t>
+        <w:t>[PLACEHOLDER] Figure 5.6 — Stage 2 crossover plot: N_req(p) vs p, with N_available line.</w:t>
       </w:r>
     </w:p>
     <w:p>
@@ -932,7 +932,7 @@
         <w:rPr>
           <w:b/>
         </w:rPr>
-        <w:t>Table 5.5 ? Method Comparison vs Baseline</w:t>
+        <w:t>Table 5.5 — Method Comparison vs Baseline</w:t>
       </w:r>
     </w:p>
     <w:tbl>
@@ -986,7 +986,7 @@
           </w:tcPr>
           <w:p>
             <w:r>
-              <w:t>? mean count (%)</w:t>
+              <w:t>Delta mean count (%)</w:t>
             </w:r>
           </w:p>
         </w:tc>
@@ -996,7 +996,7 @@
           </w:tcPr>
           <w:p>
             <w:r>
-              <w:t>? mean isolated (%)</w:t>
+              <w:t>Delta mean isolated (%)</w:t>
             </w:r>
           </w:p>
         </w:tc>
@@ -1085,7 +1085,7 @@
         <w:pStyle w:val="Heading1"/>
       </w:pPr>
       <w:r>
-        <w:t>5.7 Stage 1 Decision Statement</w:t>
+        <w:t>5.7 Grain Metrics (Placeholder; may be filled after grain rerun)</w:t>
       </w:r>
     </w:p>
     <w:p>
@@ -1093,7 +1093,39 @@
         <w:rPr>
           <w:b/>
         </w:rPr>
-        <w:t>[PLACEHOLDER] For each wt%: ?X scans required for 95% confidence of ?K isolated particles; dataset has Y scans; Stage 2 justified/not justified.?</w:t>
+        <w:t>[PLACEHOLDER] Define grain metrics exported from Gwyddion (fields + meaning).</w:t>
+      </w:r>
+    </w:p>
+    <w:p>
+      <w:r>
+        <w:rPr>
+          <w:b/>
+        </w:rPr>
+        <w:t>[PLACEHOLDER] State why grain metrics matter here (supports particle segmentation QA and advisor deliverables).</w:t>
+      </w:r>
+    </w:p>
+    <w:p>
+      <w:r>
+        <w:rPr>
+          <w:b/>
+        </w:rPr>
+        <w:t>[PLACEHOLDER] Table — Grain field summary (per job/wt%).</w:t>
+      </w:r>
+    </w:p>
+    <w:p>
+      <w:pPr>
+        <w:pStyle w:val="Heading1"/>
+      </w:pPr>
+      <w:r>
+        <w:t>5.8 Stage 1 Decision Statement</w:t>
+      </w:r>
+    </w:p>
+    <w:p>
+      <w:r>
+        <w:rPr>
+          <w:b/>
+        </w:rPr>
+        <w:t>[PLACEHOLDER] For each wt%: “X scans required for 95% confidence of &gt;=K isolated particles; dataset has Y scans; Stage 2 justified/not justified.”</w:t>
       </w:r>
     </w:p>
     <w:sectPr>

</xml_diff>